<commit_message>
added some files and pictures in doc.
</commit_message>
<xml_diff>
--- a/doc/vizsgaremek.docx
+++ b/doc/vizsgaremek.docx
@@ -288,7 +288,7 @@
           <w:szCs w:val="24"/>
           <w:rtl w:val="0"/>
         </w:rPr>
-        <w:t xml:space="preserve"> és feltölteni, valamint helyi látványosságokat és érdekes helyeket is fel tudnak tölteni és értékelni azt, ezáltal más felhasználóknak segítenek tájékozódni, hogy milyen településen, milyen helyi látványosságok vannak.Tudja szerkeszteni a fiókja adatait, be tud állítani fizetési módott. </w:t>
+        <w:t xml:space="preserve">, feltölteni és értékelni, valamint helyi látványosságokat és érdekes helyeket is értékelni, ezáltal más felhasználóknak segítenek tájékozódni, hogy milyen településen, milyen helyi látványosságok vannak.Tudja szerkeszteni a fiókja adatait, be tud állítani fizetési módott. </w:t>
       </w:r>
     </w:p>
     <w:p>
@@ -424,7 +424,7 @@
           <w:szCs w:val="24"/>
           <w:rtl w:val="0"/>
         </w:rPr>
-        <w:t xml:space="preserve">Minden szállásnál részletes leírást tud megadni az adott kiadó, emelettel képeket és akár videókat is fel tud tölteni, hogy minél jobban be tudja mutatni a kiadni kívánt szállást.</w:t>
+        <w:t xml:space="preserve">Minden szállásnál részletes leírást tud megadni az adott kiadó, emelettel képeket is fel tud tölteni, hogy minél jobban be tudja mutatni a kiadni kívánt szállást.</w:t>
       </w:r>
     </w:p>
     <w:p>
@@ -869,14 +869,14 @@
         </w:rPr>
         <w:drawing>
           <wp:inline distB="114300" distT="114300" distL="114300" distR="114300">
-            <wp:extent cx="5731200" cy="3162300"/>
+            <wp:extent cx="5731200" cy="3644900"/>
             <wp:effectExtent b="0" l="0" r="0" t="0"/>
-            <wp:docPr id="7" name="image3.png"/>
+            <wp:docPr id="7" name="image1.png"/>
             <a:graphic>
               <a:graphicData uri="http://schemas.openxmlformats.org/drawingml/2006/picture">
                 <pic:pic>
                   <pic:nvPicPr>
-                    <pic:cNvPr id="0" name="image3.png"/>
+                    <pic:cNvPr id="0" name="image1.png"/>
                     <pic:cNvPicPr preferRelativeResize="0"/>
                   </pic:nvPicPr>
                   <pic:blipFill>
@@ -889,7 +889,7 @@
                   <pic:spPr>
                     <a:xfrm>
                       <a:off x="0" y="0"/>
-                      <a:ext cx="5731200" cy="3162300"/>
+                      <a:ext cx="5731200" cy="3644900"/>
                     </a:xfrm>
                     <a:prstGeom prst="rect"/>
                     <a:ln/>
@@ -967,12 +967,12 @@
       <w:r>
         <w:rPr>
           <w:rFonts w:ascii="Times New Roman" w:cs="Times New Roman" w:eastAsia="Times New Roman" w:hAnsi="Times New Roman"/>
-          <w:sz w:val="24"/>
-          <w:szCs w:val="24"/>
+          <w:sz w:val="36"/>
+          <w:szCs w:val="36"/>
         </w:rPr>
         <w:drawing>
           <wp:inline distB="114300" distT="114300" distL="114300" distR="114300">
-            <wp:extent cx="5731200" cy="3009900"/>
+            <wp:extent cx="5731200" cy="2870200"/>
             <wp:effectExtent b="0" l="0" r="0" t="0"/>
             <wp:docPr id="5" name="image7.png"/>
             <a:graphic>
@@ -992,7 +992,7 @@
                   <pic:spPr>
                     <a:xfrm>
                       <a:off x="0" y="0"/>
-                      <a:ext cx="5731200" cy="3009900"/>
+                      <a:ext cx="5731200" cy="2870200"/>
                     </a:xfrm>
                     <a:prstGeom prst="rect"/>
                     <a:ln/>
@@ -1137,12 +1137,12 @@
           <wp:inline distB="114300" distT="114300" distL="114300" distR="114300">
             <wp:extent cx="5731200" cy="3390900"/>
             <wp:effectExtent b="0" l="0" r="0" t="0"/>
-            <wp:docPr id="6" name="image5.png"/>
+            <wp:docPr id="6" name="image2.png"/>
             <a:graphic>
               <a:graphicData uri="http://schemas.openxmlformats.org/drawingml/2006/picture">
                 <pic:pic>
                   <pic:nvPicPr>
-                    <pic:cNvPr id="0" name="image5.png"/>
+                    <pic:cNvPr id="0" name="image2.png"/>
                     <pic:cNvPicPr preferRelativeResize="0"/>
                   </pic:nvPicPr>
                   <pic:blipFill>
@@ -1195,12 +1195,12 @@
           <wp:inline distB="114300" distT="114300" distL="114300" distR="114300">
             <wp:extent cx="5731200" cy="3314700"/>
             <wp:effectExtent b="0" l="0" r="0" t="0"/>
-            <wp:docPr id="1" name="image1.png"/>
+            <wp:docPr id="1" name="image5.png"/>
             <a:graphic>
               <a:graphicData uri="http://schemas.openxmlformats.org/drawingml/2006/picture">
                 <pic:pic>
                   <pic:nvPicPr>
-                    <pic:cNvPr id="0" name="image1.png"/>
+                    <pic:cNvPr id="0" name="image5.png"/>
                     <pic:cNvPicPr preferRelativeResize="0"/>
                   </pic:nvPicPr>
                   <pic:blipFill>
@@ -1236,12 +1236,12 @@
           <wp:inline distB="114300" distT="114300" distL="114300" distR="114300">
             <wp:extent cx="5731200" cy="3340100"/>
             <wp:effectExtent b="0" l="0" r="0" t="0"/>
-            <wp:docPr id="3" name="image2.png"/>
+            <wp:docPr id="3" name="image3.png"/>
             <a:graphic>
               <a:graphicData uri="http://schemas.openxmlformats.org/drawingml/2006/picture">
                 <pic:pic>
                   <pic:nvPicPr>
-                    <pic:cNvPr id="0" name="image2.png"/>
+                    <pic:cNvPr id="0" name="image3.png"/>
                     <pic:cNvPicPr preferRelativeResize="0"/>
                   </pic:nvPicPr>
                   <pic:blipFill>
@@ -1277,12 +1277,12 @@
           <wp:inline distB="114300" distT="114300" distL="114300" distR="114300">
             <wp:extent cx="5731200" cy="3365500"/>
             <wp:effectExtent b="0" l="0" r="0" t="0"/>
-            <wp:docPr id="2" name="image4.png"/>
+            <wp:docPr id="2" name="image6.png"/>
             <a:graphic>
               <a:graphicData uri="http://schemas.openxmlformats.org/drawingml/2006/picture">
                 <pic:pic>
                   <pic:nvPicPr>
-                    <pic:cNvPr id="0" name="image4.png"/>
+                    <pic:cNvPr id="0" name="image6.png"/>
                     <pic:cNvPicPr preferRelativeResize="0"/>
                   </pic:nvPicPr>
                   <pic:blipFill>
@@ -1318,12 +1318,12 @@
           <wp:inline distB="114300" distT="114300" distL="114300" distR="114300">
             <wp:extent cx="5731200" cy="3352800"/>
             <wp:effectExtent b="0" l="0" r="0" t="0"/>
-            <wp:docPr id="4" name="image6.png"/>
+            <wp:docPr id="4" name="image4.png"/>
             <a:graphic>
               <a:graphicData uri="http://schemas.openxmlformats.org/drawingml/2006/picture">
                 <pic:pic>
                   <pic:nvPicPr>
-                    <pic:cNvPr id="0" name="image6.png"/>
+                    <pic:cNvPr id="0" name="image4.png"/>
                     <pic:cNvPicPr preferRelativeResize="0"/>
                   </pic:nvPicPr>
                   <pic:blipFill>

</xml_diff>